<commit_message>
Geschichte 8: Test Aufgabe 5 als Stellungnahme, Zusatzaufgabe
Co-Authored-By: Claude Sonnet 5.5 <noreply@anthropic.com>
Claude-Session: https://claude.ai/code/session_01CtRuNVyt8v9M882BKEmgNb
</commit_message>
<xml_diff>
--- a/Geschichte_8/Test_Staendegesellschaft_Absolutismus/Erwartungshorizont_Test.docx
+++ b/Geschichte_8/Test_Staendegesellschaft_Absolutismus/Erwartungshorizont_Test.docx
@@ -45,7 +45,7 @@
           <w:sz w:val="22"/>
           <w:szCs w:val="22"/>
         </w:rPr>
-        <w:t xml:space="preserve">Gesamtpunktzahl: 28 Punkte. Formulierungen dürfen abweichen, entscheidend ist der Inhalt. Folgefehler werden nicht doppelt bestraft. Die Angaben stammen aus den Gruppenpuzzle-Texten (Stände, Säulen) und den Merksätzen der Wiederholungsstunde.</w:t>
+        <w:t xml:space="preserve">Gesamtpunktzahl: 28 Punkte plus 3 Zusatzpunkte. Formulierungen dürfen abweichen, entscheidend ist der Inhalt. Folgefehler werden nicht doppelt bestraft. Die Angaben stammen aus den Gruppenpuzzle-Texten (Stände, Säulen) und den Merksätzen der Wiederholungsstunde.</w:t>
       </w:r>
     </w:p>
     <w:p>
@@ -1256,7 +1256,7 @@
           <w:sz w:val="28"/>
           <w:szCs w:val="28"/>
         </w:rPr>
-        <w:t xml:space="preserve">Im Absolutismus fühle ich mich …</w:t>
+        <w:t xml:space="preserve">Stellung nehmen</w:t>
       </w:r>
       <w:r>
         <w:rPr>
@@ -1289,7 +1289,7 @@
           <w:sz w:val="22"/>
           <w:szCs w:val="22"/>
         </w:rPr>
-        <w:t xml:space="preserve">Stand gewählt und passendes Gefühl formuliert.</w:t>
+        <w:t xml:space="preserve">Klare Position: Die Aussage stimmt nicht, denn der Stand entschied über Rechte, Pflichten und Lebenschancen.</w:t>
       </w:r>
       <w:r>
         <w:rPr>
@@ -1324,7 +1324,7 @@
           <w:sz w:val="22"/>
           <w:szCs w:val="22"/>
         </w:rPr>
-        <w:t xml:space="preserve">Mindestens ein zutreffendes Vorrecht (oder „keine Vorrechte“ beim Dritten Stand) genannt.</w:t>
+        <w:t xml:space="preserve">Zwei zutreffende Argumente (je 1 P), zum Beispiel:</w:t>
       </w:r>
       <w:r>
         <w:rPr>
@@ -1335,7 +1335,82 @@
           <w:sz w:val="20"/>
           <w:szCs w:val="20"/>
         </w:rPr>
-        <w:t xml:space="preserve">  [1 P]</w:t>
+        <w:t xml:space="preserve">  [2 P]</w:t>
+      </w:r>
+    </w:p>
+    <w:p>
+      <w:pPr>
+        <w:spacing w:after="30" w:before="0"/>
+        <w:ind w:left="600"/>
+      </w:pPr>
+      <w:r>
+        <w:rPr>
+          <w:rFonts w:ascii="Calibri" w:cs="Calibri" w:eastAsia="Calibri" w:hAnsi="Calibri"/>
+          <w:color w:val="333333"/>
+          <w:sz w:val="20"/>
+          <w:szCs w:val="20"/>
+        </w:rPr>
+        <w:t xml:space="preserve">Vorrechte: Klerus und Adel zahlten keine Steuern (Adel zusätzlich alleiniges Jagdrecht und ranghohe Posten in der Armee), der Dritte Stand (Bauern und Bürger) zahlte Steuern, hohe Abgaben und Pachtgebühren.</w:t>
+      </w:r>
+    </w:p>
+    <w:p>
+      <w:pPr>
+        <w:spacing w:after="30" w:before="0"/>
+        <w:ind w:left="600"/>
+      </w:pPr>
+      <w:r>
+        <w:rPr>
+          <w:rFonts w:ascii="Calibri" w:cs="Calibri" w:eastAsia="Calibri" w:hAnsi="Calibri"/>
+          <w:color w:val="333333"/>
+          <w:sz w:val="20"/>
+          <w:szCs w:val="20"/>
+        </w:rPr>
+        <w:t xml:space="preserve">Mitbestimmung: Der Dritte Stand war von der politischen Mitbestimmung ausgeschlossen, der Adel bestimmte das politische Geschehen mit.</w:t>
+      </w:r>
+    </w:p>
+    <w:p>
+      <w:pPr>
+        <w:spacing w:after="30" w:before="0"/>
+        <w:ind w:left="600"/>
+      </w:pPr>
+      <w:r>
+        <w:rPr>
+          <w:rFonts w:ascii="Calibri" w:cs="Calibri" w:eastAsia="Calibri" w:hAnsi="Calibri"/>
+          <w:color w:val="333333"/>
+          <w:sz w:val="20"/>
+          <w:szCs w:val="20"/>
+        </w:rPr>
+        <w:t xml:space="preserve">Geburt: Man wurde in den Stand hineingeboren, für den Dritten Stand gab es kaum Möglichkeit aufzusteigen. In den Klerus kam man nur durch Berufung der Kirche.</w:t>
+      </w:r>
+    </w:p>
+    <w:p>
+      <w:pPr>
+        <w:spacing w:after="30" w:before="0"/>
+        <w:ind w:left="600"/>
+      </w:pPr>
+      <w:r>
+        <w:rPr>
+          <w:rFonts w:ascii="Calibri" w:cs="Calibri" w:eastAsia="Calibri" w:hAnsi="Calibri"/>
+          <w:color w:val="333333"/>
+          <w:sz w:val="20"/>
+          <w:szCs w:val="20"/>
+        </w:rPr>
+        <w:t xml:space="preserve">Bildung: Klerus und Adel waren meist sehr gebildet, vom Dritten Stand konnten nur wenige lesen und schreiben.</w:t>
+      </w:r>
+    </w:p>
+    <w:p>
+      <w:pPr>
+        <w:spacing w:after="30" w:before="0"/>
+        <w:ind w:left="600"/>
+      </w:pPr>
+      <w:r>
+        <w:rPr>
+          <w:rFonts w:ascii="Calibri" w:cs="Calibri" w:eastAsia="Calibri" w:hAnsi="Calibri"/>
+          <w:color w:val="333333"/>
+          <w:sz w:val="20"/>
+          <w:szCs w:val="20"/>
+        </w:rPr>
+        <w:t xml:space="preserve">Anzahl: Wenige Privilegierte (ca. 650 000) standen ca. 20 000 000 Menschen gegenüber, die die Last trugen.</w:t>
       </w:r>
     </w:p>
     <w:p>
@@ -1359,7 +1434,7 @@
           <w:sz w:val="22"/>
           <w:szCs w:val="22"/>
         </w:rPr>
-        <w:t xml:space="preserve">Mindestens eine zutreffende Pflicht genannt.</w:t>
+        <w:t xml:space="preserve">Schlüssige Darstellung mit Fachbegriffen (z. B. Vorrechte, Steuern, Mitbestimmung) und „weil“-Verknüpfung.</w:t>
       </w:r>
       <w:r>
         <w:rPr>
@@ -1375,6 +1450,32 @@
     </w:p>
     <w:p>
       <w:pPr>
+        <w:keepNext/>
+        <w:spacing w:after="100" w:before="240"/>
+      </w:pPr>
+      <w:r>
+        <w:rPr>
+          <w:rFonts w:ascii="Cambria" w:cs="Cambria" w:eastAsia="Cambria" w:hAnsi="Cambria"/>
+          <w:b/>
+          <w:bCs/>
+          <w:color w:val="C98A1E"/>
+          <w:sz w:val="28"/>
+          <w:szCs w:val="28"/>
+        </w:rPr>
+        <w:t xml:space="preserve">Zusatzaufgabe  </w:t>
+      </w:r>
+      <w:r>
+        <w:rPr>
+          <w:rFonts w:ascii="Calibri" w:cs="Calibri" w:eastAsia="Calibri" w:hAnsi="Calibri"/>
+          <w:color w:val="5B6B8C"/>
+          <w:sz w:val="22"/>
+          <w:szCs w:val="22"/>
+        </w:rPr>
+        <w:t xml:space="preserve">(3 Zusatzpunkte)</w:t>
+      </w:r>
+    </w:p>
+    <w:p>
+      <w:pPr>
         <w:spacing w:after="50" w:before="0"/>
         <w:ind w:left="240"/>
       </w:pPr>
@@ -1394,7 +1495,7 @@
           <w:sz w:val="22"/>
           <w:szCs w:val="22"/>
         </w:rPr>
-        <w:t xml:space="preserve">Begründung ist schlüssig (Gefühl passt zu Vorrechten und Pflichten, mit „weil“ verbunden).</w:t>
+        <w:t xml:space="preserve">Der König vereint alle Macht bei sich, niemand kann ihn stoppen: absolute Herrschaft („Der Staat bin ich“ = Staat und König sind eins).</w:t>
       </w:r>
       <w:r>
         <w:rPr>
@@ -1410,6 +1511,41 @@
     </w:p>
     <w:p>
       <w:pPr>
+        <w:spacing w:after="50" w:before="0"/>
+        <w:ind w:left="240"/>
+      </w:pPr>
+      <w:r>
+        <w:rPr>
+          <w:rFonts w:ascii="Calibri" w:cs="Calibri" w:eastAsia="Calibri" w:hAnsi="Calibri"/>
+          <w:color w:val="000000"/>
+          <w:sz w:val="22"/>
+          <w:szCs w:val="22"/>
+        </w:rPr>
+        <w:t xml:space="preserve">• </w:t>
+      </w:r>
+      <w:r>
+        <w:rPr>
+          <w:rFonts w:ascii="Calibri" w:cs="Calibri" w:eastAsia="Calibri" w:hAnsi="Calibri"/>
+          <w:color w:val="000000"/>
+          <w:sz w:val="22"/>
+          <w:szCs w:val="22"/>
+        </w:rPr>
+        <w:t xml:space="preserve">Zwei Säulen zutreffend einbezogen und erklärt, z. B. Verwaltung und Justiz (Beamte handeln in seinem Namen, er ist oberster Richter) und Heer (stehendes Heer setzt die Macht durch).</w:t>
+      </w:r>
+      <w:r>
+        <w:rPr>
+          <w:rFonts w:ascii="Calibri" w:cs="Calibri" w:eastAsia="Calibri" w:hAnsi="Calibri"/>
+          <w:b/>
+          <w:bCs/>
+          <w:color w:val="D9534F"/>
+          <w:sz w:val="20"/>
+          <w:szCs w:val="20"/>
+        </w:rPr>
+        <w:t xml:space="preserve">  [2 (je 1) P]</w:t>
+      </w:r>
+    </w:p>
+    <w:p>
+      <w:pPr>
         <w:spacing w:after="100" w:before="40"/>
       </w:pPr>
       <w:r>
@@ -1419,7 +1555,7 @@
           <w:sz w:val="22"/>
           <w:szCs w:val="22"/>
         </w:rPr>
-        <w:t xml:space="preserve">Beispiele: „… als Adeliger privilegiert, weil ich keine Steuern zahlen muss und allein jagen darf. Dafür muss ich mich ehrenhaft verhalten und Verwaltungsaufgaben übernehmen.“ · „… als Bauer ausgenutzt, weil ich Steuern, hohe Abgaben und Pachtgebühren zahlen muss und von der Mitbestimmung ausgeschlossen bin.“</w:t>
+        <w:t xml:space="preserve">Die Zusatzpunkte werden zur Gesamtpunktzahl addiert. Die Höchstnote ist weiterhin ab 26 Punkten erreicht (auch mit Zusatzpunkten ausgleichbar). Maximal erreichbar: 31 Punkte.</w:t>
       </w:r>
     </w:p>
     <w:p>

</xml_diff>

<commit_message>
Geschichte 8: Test mit Wahr/falsch, Buchstaben-Zuordnung, Zusatz nur 1 Punkt
Co-Authored-By: Claude Sonnet 5.5 <noreply@anthropic.com>
Claude-Session: https://claude.ai/code/session_01CtRuNVyt8v9M882BKEmgNb
</commit_message>
<xml_diff>
--- a/Geschichte_8/Test_Staendegesellschaft_Absolutismus/Erwartungshorizont_Test.docx
+++ b/Geschichte_8/Test_Staendegesellschaft_Absolutismus/Erwartungshorizont_Test.docx
@@ -45,7 +45,7 @@
           <w:sz w:val="22"/>
           <w:szCs w:val="22"/>
         </w:rPr>
-        <w:t xml:space="preserve">Gesamtpunktzahl: 28 Punkte plus 3 Zusatzpunkte. Formulierungen dürfen abweichen, entscheidend ist der Inhalt. Folgefehler werden nicht doppelt bestraft. Die Angaben stammen aus den Gruppenpuzzle-Texten (Stände, Säulen) und den Merksätzen der Wiederholungsstunde.</w:t>
+        <w:t xml:space="preserve">Gesamtpunktzahl: 30 Punkte plus 1 Zusatzpunkt. Formulierungen dürfen abweichen, entscheidend ist der Inhalt. Folgefehler werden nicht doppelt bestraft. Die Angaben stammen aus den Gruppenpuzzle-Texten (Stände, Säulen) und den Merksätzen der Wiederholungsstunde.</w:t>
       </w:r>
     </w:p>
     <w:p>
@@ -82,7 +82,7 @@
           <w:sz w:val="22"/>
           <w:szCs w:val="22"/>
         </w:rPr>
-        <w:t xml:space="preserve">   (4 Punkte)</w:t>
+        <w:t xml:space="preserve">   (3 Punkte)</w:t>
       </w:r>
     </w:p>
     <w:p>
@@ -122,16 +122,17 @@
     </w:p>
     <w:p>
       <w:pPr>
-        <w:spacing w:after="50" w:before="0"/>
-      </w:pPr>
-      <w:r>
-        <w:rPr>
-          <w:rFonts w:ascii="Calibri" w:cs="Calibri" w:eastAsia="Calibri" w:hAnsi="Calibri"/>
-          <w:color w:val="5B6B8C"/>
-          <w:sz w:val="22"/>
-          <w:szCs w:val="22"/>
-        </w:rPr>
-        <w:t xml:space="preserve">   Verteilung: 1 P für „Herrschaftsform / Monarch herrscht allein“, 1 P für „uneingeschränkt / niemand kann ihn stoppen“ (oder 17./18. Jahrhundert).</w:t>
+        <w:spacing w:after="30" w:before="0"/>
+        <w:ind w:left="600"/>
+      </w:pPr>
+      <w:r>
+        <w:rPr>
+          <w:rFonts w:ascii="Calibri" w:cs="Calibri" w:eastAsia="Calibri" w:hAnsi="Calibri"/>
+          <w:color w:val="333333"/>
+          <w:sz w:val="20"/>
+          <w:szCs w:val="20"/>
+        </w:rPr>
+        <w:t xml:space="preserve">1 P für „Herrschaftsform / Monarch herrscht allein“, 1 P für „uneingeschränkt / niemand kann ihn stoppen“ (oder 17./18. Jahrhundert).</w:t>
       </w:r>
     </w:p>
     <w:p>
@@ -155,7 +156,7 @@
           <w:sz w:val="22"/>
           <w:szCs w:val="22"/>
         </w:rPr>
-        <w:t xml:space="preserve">b) Aussage 1 passt: Der König entscheidet allein, niemand kann ihn stoppen.</w:t>
+        <w:t xml:space="preserve">b) Passt nicht: Ein Parlament könnte den König stoppen, seine Macht wäre begrenzt (Entscheidung und Begründung).</w:t>
       </w:r>
       <w:r>
         <w:rPr>
@@ -171,6 +172,43 @@
     </w:p>
     <w:p>
       <w:pPr>
+        <w:keepNext/>
+        <w:spacing w:after="100" w:before="240"/>
+      </w:pPr>
+      <w:r>
+        <w:rPr>
+          <w:rFonts w:ascii="Cambria" w:cs="Cambria" w:eastAsia="Cambria" w:hAnsi="Cambria"/>
+          <w:b/>
+          <w:bCs/>
+          <w:color w:val="D9534F"/>
+          <w:sz w:val="28"/>
+          <w:szCs w:val="28"/>
+        </w:rPr>
+        <w:t xml:space="preserve">Aufgabe 2  </w:t>
+      </w:r>
+      <w:r>
+        <w:rPr>
+          <w:rFonts w:ascii="Cambria" w:cs="Cambria" w:eastAsia="Cambria" w:hAnsi="Cambria"/>
+          <w:b/>
+          <w:bCs/>
+          <w:color w:val="1E2761"/>
+          <w:sz w:val="28"/>
+          <w:szCs w:val="28"/>
+        </w:rPr>
+        <w:t xml:space="preserve">Die drei Stände</w:t>
+      </w:r>
+      <w:r>
+        <w:rPr>
+          <w:rFonts w:ascii="Calibri" w:cs="Calibri" w:eastAsia="Calibri" w:hAnsi="Calibri"/>
+          <w:color w:val="5B6B8C"/>
+          <w:sz w:val="22"/>
+          <w:szCs w:val="22"/>
+        </w:rPr>
+        <w:t xml:space="preserve">   (7 Punkte)</w:t>
+      </w:r>
+    </w:p>
+    <w:p>
+      <w:pPr>
         <w:spacing w:after="50" w:before="0"/>
         <w:ind w:left="240"/>
       </w:pPr>
@@ -190,7 +228,7 @@
           <w:sz w:val="22"/>
           <w:szCs w:val="22"/>
         </w:rPr>
-        <w:t xml:space="preserve">    Aussage 2 passt nicht: Ein Parlament würde den König stoppen können, die Macht wäre begrenzt.</w:t>
+        <w:t xml:space="preserve">a) Klerus ca. 150 000 · Adel ca. 500 000 · Dritter Stand (Bauern und Bürger) ca. 20 000 000 (Größenordnung genügt).</w:t>
       </w:r>
       <w:r>
         <w:rPr>
@@ -201,58 +239,42 @@
           <w:sz w:val="20"/>
           <w:szCs w:val="20"/>
         </w:rPr>
-        <w:t xml:space="preserve">  [1 P]</w:t>
-      </w:r>
-    </w:p>
-    <w:p>
-      <w:pPr>
-        <w:keepNext/>
-        <w:spacing w:after="100" w:before="240"/>
-      </w:pPr>
-      <w:r>
-        <w:rPr>
-          <w:rFonts w:ascii="Cambria" w:cs="Cambria" w:eastAsia="Cambria" w:hAnsi="Cambria"/>
+        <w:t xml:space="preserve">  [3 (je 1) P]</w:t>
+      </w:r>
+    </w:p>
+    <w:p>
+      <w:pPr>
+        <w:spacing w:after="50" w:before="0"/>
+        <w:ind w:left="240"/>
+      </w:pPr>
+      <w:r>
+        <w:rPr>
+          <w:rFonts w:ascii="Calibri" w:cs="Calibri" w:eastAsia="Calibri" w:hAnsi="Calibri"/>
+          <w:color w:val="000000"/>
+          <w:sz w:val="22"/>
+          <w:szCs w:val="22"/>
+        </w:rPr>
+        <w:t xml:space="preserve">• </w:t>
+      </w:r>
+      <w:r>
+        <w:rPr>
+          <w:rFonts w:ascii="Calibri" w:cs="Calibri" w:eastAsia="Calibri" w:hAnsi="Calibri"/>
+          <w:color w:val="000000"/>
+          <w:sz w:val="22"/>
+          <w:szCs w:val="22"/>
+        </w:rPr>
+        <w:t xml:space="preserve">b) Je 2 richtig eingetragene Buchstaben ergeben 1 Punkt (insgesamt 8 richtige Eintragungen). Falsch eingetragene Buchstaben heben je eine richtige Eintragung auf.</w:t>
+      </w:r>
+      <w:r>
+        <w:rPr>
+          <w:rFonts w:ascii="Calibri" w:cs="Calibri" w:eastAsia="Calibri" w:hAnsi="Calibri"/>
           <w:b/>
           <w:bCs/>
           <w:color w:val="D9534F"/>
-          <w:sz w:val="28"/>
-          <w:szCs w:val="28"/>
-        </w:rPr>
-        <w:t xml:space="preserve">Aufgabe 2  </w:t>
-      </w:r>
-      <w:r>
-        <w:rPr>
-          <w:rFonts w:ascii="Cambria" w:cs="Cambria" w:eastAsia="Cambria" w:hAnsi="Cambria"/>
-          <w:b/>
-          <w:bCs/>
-          <w:color w:val="1E2761"/>
-          <w:sz w:val="28"/>
-          <w:szCs w:val="28"/>
-        </w:rPr>
-        <w:t xml:space="preserve">Die drei Stände</w:t>
-      </w:r>
-      <w:r>
-        <w:rPr>
-          <w:rFonts w:ascii="Calibri" w:cs="Calibri" w:eastAsia="Calibri" w:hAnsi="Calibri"/>
-          <w:color w:val="5B6B8C"/>
-          <w:sz w:val="22"/>
-          <w:szCs w:val="22"/>
-        </w:rPr>
-        <w:t xml:space="preserve">   (9 Punkte)</w:t>
-      </w:r>
-    </w:p>
-    <w:p>
-      <w:pPr>
-        <w:spacing w:after="60" w:before="0"/>
-      </w:pPr>
-      <w:r>
-        <w:rPr>
-          <w:rFonts w:ascii="Calibri" w:cs="Calibri" w:eastAsia="Calibri" w:hAnsi="Calibri"/>
-          <w:color w:val="000000"/>
-          <w:sz w:val="22"/>
-          <w:szCs w:val="22"/>
-        </w:rPr>
-        <w:t xml:space="preserve">Je 1 P pro richtiger Zelle. Anzahl: etwa richtige Größenordnung genügt. Vorrecht und Pflicht: ein zutreffendes Beispiel genügt.</w:t>
+          <w:sz w:val="20"/>
+          <w:szCs w:val="20"/>
+        </w:rPr>
+        <w:t xml:space="preserve">  [4 P]</w:t>
       </w:r>
     </w:p>
     <w:tbl>
@@ -268,10 +290,10 @@
         </w:tblBorders>
       </w:tblPr>
       <w:tblGrid>
+        <w:gridCol w:w="2900"/>
         <w:gridCol w:w="2300"/>
-        <w:gridCol w:w="1500"/>
-        <w:gridCol w:w="3300"/>
-        <w:gridCol w:w="3106"/>
+        <w:gridCol w:w="2500"/>
+        <w:gridCol w:w="2506"/>
       </w:tblGrid>
       <w:tr>
         <w:trPr>
@@ -279,14 +301,14 @@
         </w:trPr>
         <w:tc>
           <w:tcPr>
-            <w:tcW w:type="dxa" w:w="2300"/>
-            <w:tcBorders>
-              <w:top w:val="single" w:color="8A96B5" w:sz="6"/>
-              <w:left w:val="single" w:color="8A96B5" w:sz="6"/>
-              <w:bottom w:val="single" w:color="8A96B5" w:sz="6"/>
-              <w:right w:val="single" w:color="8A96B5" w:sz="6"/>
-            </w:tcBorders>
-            <w:shd w:fill="1E2761" w:color="auto" w:val="clear"/>
+            <w:tcW w:type="dxa" w:w="2900"/>
+            <w:tcBorders>
+              <w:top w:val="single" w:color="8A96B5" w:sz="6"/>
+              <w:left w:val="single" w:color="8A96B5" w:sz="6"/>
+              <w:bottom w:val="single" w:color="8A96B5" w:sz="6"/>
+              <w:right w:val="single" w:color="8A96B5" w:sz="6"/>
+            </w:tcBorders>
+            <w:shd w:fill="3D4A3F" w:color="auto" w:val="clear"/>
             <w:tcMar>
               <w:top w:type="dxa" w:w="80"/>
               <w:left w:type="dxa" w:w="120"/>
@@ -306,8 +328,8 @@
                 <w:b/>
                 <w:bCs/>
                 <w:color w:val="FFFFFF"/>
-                <w:sz w:val="20"/>
-                <w:szCs w:val="20"/>
+                <w:sz w:val="22"/>
+                <w:szCs w:val="22"/>
               </w:rPr>
               <w:t xml:space="preserve">Stand</w:t>
             </w:r>
@@ -315,14 +337,14 @@
         </w:tc>
         <w:tc>
           <w:tcPr>
-            <w:tcW w:type="dxa" w:w="1500"/>
-            <w:tcBorders>
-              <w:top w:val="single" w:color="8A96B5" w:sz="6"/>
-              <w:left w:val="single" w:color="8A96B5" w:sz="6"/>
-              <w:bottom w:val="single" w:color="8A96B5" w:sz="6"/>
-              <w:right w:val="single" w:color="8A96B5" w:sz="6"/>
-            </w:tcBorders>
-            <w:shd w:fill="1E2761" w:color="auto" w:val="clear"/>
+            <w:tcW w:type="dxa" w:w="2300"/>
+            <w:tcBorders>
+              <w:top w:val="single" w:color="8A96B5" w:sz="6"/>
+              <w:left w:val="single" w:color="8A96B5" w:sz="6"/>
+              <w:bottom w:val="single" w:color="8A96B5" w:sz="6"/>
+              <w:right w:val="single" w:color="8A96B5" w:sz="6"/>
+            </w:tcBorders>
+            <w:shd w:fill="3D4A3F" w:color="auto" w:val="clear"/>
             <w:tcMar>
               <w:top w:type="dxa" w:w="80"/>
               <w:left w:type="dxa" w:w="120"/>
@@ -342,8 +364,8 @@
                 <w:b/>
                 <w:bCs/>
                 <w:color w:val="FFFFFF"/>
-                <w:sz w:val="20"/>
-                <w:szCs w:val="20"/>
+                <w:sz w:val="22"/>
+                <w:szCs w:val="22"/>
               </w:rPr>
               <w:t xml:space="preserve">Anzahl</w:t>
             </w:r>
@@ -351,14 +373,14 @@
         </w:tc>
         <w:tc>
           <w:tcPr>
-            <w:tcW w:type="dxa" w:w="3300"/>
-            <w:tcBorders>
-              <w:top w:val="single" w:color="8A96B5" w:sz="6"/>
-              <w:left w:val="single" w:color="8A96B5" w:sz="6"/>
-              <w:bottom w:val="single" w:color="8A96B5" w:sz="6"/>
-              <w:right w:val="single" w:color="8A96B5" w:sz="6"/>
-            </w:tcBorders>
-            <w:shd w:fill="1E2761" w:color="auto" w:val="clear"/>
+            <w:tcW w:type="dxa" w:w="2500"/>
+            <w:tcBorders>
+              <w:top w:val="single" w:color="8A96B5" w:sz="6"/>
+              <w:left w:val="single" w:color="8A96B5" w:sz="6"/>
+              <w:bottom w:val="single" w:color="8A96B5" w:sz="6"/>
+              <w:right w:val="single" w:color="8A96B5" w:sz="6"/>
+            </w:tcBorders>
+            <w:shd w:fill="3D4A3F" w:color="auto" w:val="clear"/>
             <w:tcMar>
               <w:top w:type="dxa" w:w="80"/>
               <w:left w:type="dxa" w:w="120"/>
@@ -378,23 +400,23 @@
                 <w:b/>
                 <w:bCs/>
                 <w:color w:val="FFFFFF"/>
-                <w:sz w:val="20"/>
-                <w:szCs w:val="20"/>
-              </w:rPr>
-              <w:t xml:space="preserve">mögliche Vorrechte</w:t>
-            </w:r>
-          </w:p>
-        </w:tc>
-        <w:tc>
-          <w:tcPr>
-            <w:tcW w:type="dxa" w:w="3106"/>
-            <w:tcBorders>
-              <w:top w:val="single" w:color="8A96B5" w:sz="6"/>
-              <w:left w:val="single" w:color="8A96B5" w:sz="6"/>
-              <w:bottom w:val="single" w:color="8A96B5" w:sz="6"/>
-              <w:right w:val="single" w:color="8A96B5" w:sz="6"/>
-            </w:tcBorders>
-            <w:shd w:fill="1E2761" w:color="auto" w:val="clear"/>
+                <w:sz w:val="22"/>
+                <w:szCs w:val="22"/>
+              </w:rPr>
+              <w:t xml:space="preserve">Vorrechte</w:t>
+            </w:r>
+          </w:p>
+        </w:tc>
+        <w:tc>
+          <w:tcPr>
+            <w:tcW w:type="dxa" w:w="2506"/>
+            <w:tcBorders>
+              <w:top w:val="single" w:color="8A96B5" w:sz="6"/>
+              <w:left w:val="single" w:color="8A96B5" w:sz="6"/>
+              <w:bottom w:val="single" w:color="8A96B5" w:sz="6"/>
+              <w:right w:val="single" w:color="8A96B5" w:sz="6"/>
+            </w:tcBorders>
+            <w:shd w:fill="3D4A3F" w:color="auto" w:val="clear"/>
             <w:tcMar>
               <w:top w:type="dxa" w:w="80"/>
               <w:left w:type="dxa" w:w="120"/>
@@ -414,10 +436,10 @@
                 <w:b/>
                 <w:bCs/>
                 <w:color w:val="FFFFFF"/>
-                <w:sz w:val="20"/>
-                <w:szCs w:val="20"/>
-              </w:rPr>
-              <w:t xml:space="preserve">mögliche Pflichten</w:t>
+                <w:sz w:val="22"/>
+                <w:szCs w:val="22"/>
+              </w:rPr>
+              <w:t xml:space="preserve">Pflichten</w:t>
             </w:r>
           </w:p>
         </w:tc>
@@ -429,7 +451,7 @@
         </w:trPr>
         <w:tc>
           <w:tcPr>
-            <w:tcW w:type="dxa" w:w="2300"/>
+            <w:tcW w:type="dxa" w:w="2900"/>
             <w:tcBorders>
               <w:top w:val="single" w:color="8A96B5" w:sz="6"/>
               <w:left w:val="single" w:color="8A96B5" w:sz="6"/>
@@ -455,8 +477,8 @@
                 <w:b/>
                 <w:bCs/>
                 <w:color w:val="000000"/>
-                <w:sz w:val="20"/>
-                <w:szCs w:val="20"/>
+                <w:sz w:val="22"/>
+                <w:szCs w:val="22"/>
               </w:rPr>
               <w:t xml:space="preserve">Klerus</w:t>
             </w:r>
@@ -464,7 +486,7 @@
         </w:tc>
         <w:tc>
           <w:tcPr>
-            <w:tcW w:type="dxa" w:w="1500"/>
+            <w:tcW w:type="dxa" w:w="2300"/>
             <w:tcBorders>
               <w:top w:val="single" w:color="8A96B5" w:sz="6"/>
               <w:left w:val="single" w:color="8A96B5" w:sz="6"/>
@@ -489,8 +511,8 @@
                 <w:b w:val="false"/>
                 <w:bCs w:val="false"/>
                 <w:color w:val="000000"/>
-                <w:sz w:val="20"/>
-                <w:szCs w:val="20"/>
+                <w:sz w:val="22"/>
+                <w:szCs w:val="22"/>
               </w:rPr>
               <w:t xml:space="preserve">ca. 150 000</w:t>
             </w:r>
@@ -498,7 +520,7 @@
         </w:tc>
         <w:tc>
           <w:tcPr>
-            <w:tcW w:type="dxa" w:w="3300"/>
+            <w:tcW w:type="dxa" w:w="2500"/>
             <w:tcBorders>
               <w:top w:val="single" w:color="8A96B5" w:sz="6"/>
               <w:left w:val="single" w:color="8A96B5" w:sz="6"/>
@@ -523,16 +545,16 @@
                 <w:b w:val="false"/>
                 <w:bCs w:val="false"/>
                 <w:color w:val="000000"/>
-                <w:sz w:val="20"/>
-                <w:szCs w:val="20"/>
-              </w:rPr>
-              <w:t xml:space="preserve">keine Steuern · eigene Gerichte · vom Wehrdienst befreit · Kirchenzehnt (10 %)</w:t>
-            </w:r>
-          </w:p>
-        </w:tc>
-        <w:tc>
-          <w:tcPr>
-            <w:tcW w:type="dxa" w:w="3106"/>
+                <w:sz w:val="22"/>
+                <w:szCs w:val="22"/>
+              </w:rPr>
+              <w:t xml:space="preserve">A, B</w:t>
+            </w:r>
+          </w:p>
+        </w:tc>
+        <w:tc>
+          <w:tcPr>
+            <w:tcW w:type="dxa" w:w="2506"/>
             <w:tcBorders>
               <w:top w:val="single" w:color="8A96B5" w:sz="6"/>
               <w:left w:val="single" w:color="8A96B5" w:sz="6"/>
@@ -557,10 +579,10 @@
                 <w:b w:val="false"/>
                 <w:bCs w:val="false"/>
                 <w:color w:val="000000"/>
-                <w:sz w:val="20"/>
-                <w:szCs w:val="20"/>
-              </w:rPr>
-              <w:t xml:space="preserve">Fürsorge für die Armen</w:t>
+                <w:sz w:val="22"/>
+                <w:szCs w:val="22"/>
+              </w:rPr>
+              <w:t xml:space="preserve">D</w:t>
             </w:r>
           </w:p>
         </w:tc>
@@ -572,7 +594,7 @@
         </w:trPr>
         <w:tc>
           <w:tcPr>
-            <w:tcW w:type="dxa" w:w="2300"/>
+            <w:tcW w:type="dxa" w:w="2900"/>
             <w:tcBorders>
               <w:top w:val="single" w:color="8A96B5" w:sz="6"/>
               <w:left w:val="single" w:color="8A96B5" w:sz="6"/>
@@ -598,8 +620,8 @@
                 <w:b/>
                 <w:bCs/>
                 <w:color w:val="000000"/>
-                <w:sz w:val="20"/>
-                <w:szCs w:val="20"/>
+                <w:sz w:val="22"/>
+                <w:szCs w:val="22"/>
               </w:rPr>
               <w:t xml:space="preserve">Adel</w:t>
             </w:r>
@@ -607,7 +629,7 @@
         </w:tc>
         <w:tc>
           <w:tcPr>
-            <w:tcW w:type="dxa" w:w="1500"/>
+            <w:tcW w:type="dxa" w:w="2300"/>
             <w:tcBorders>
               <w:top w:val="single" w:color="8A96B5" w:sz="6"/>
               <w:left w:val="single" w:color="8A96B5" w:sz="6"/>
@@ -632,8 +654,8 @@
                 <w:b w:val="false"/>
                 <w:bCs w:val="false"/>
                 <w:color w:val="000000"/>
-                <w:sz w:val="20"/>
-                <w:szCs w:val="20"/>
+                <w:sz w:val="22"/>
+                <w:szCs w:val="22"/>
               </w:rPr>
               <w:t xml:space="preserve">ca. 500 000</w:t>
             </w:r>
@@ -641,7 +663,7 @@
         </w:tc>
         <w:tc>
           <w:tcPr>
-            <w:tcW w:type="dxa" w:w="3300"/>
+            <w:tcW w:type="dxa" w:w="2500"/>
             <w:tcBorders>
               <w:top w:val="single" w:color="8A96B5" w:sz="6"/>
               <w:left w:val="single" w:color="8A96B5" w:sz="6"/>
@@ -666,16 +688,16 @@
                 <w:b w:val="false"/>
                 <w:bCs w:val="false"/>
                 <w:color w:val="000000"/>
-                <w:sz w:val="20"/>
-                <w:szCs w:val="20"/>
-              </w:rPr>
-              <w:t xml:space="preserve">keine Steuern · alleiniges Jagdrecht · ranghohe Posten in der Armee</w:t>
-            </w:r>
-          </w:p>
-        </w:tc>
-        <w:tc>
-          <w:tcPr>
-            <w:tcW w:type="dxa" w:w="3106"/>
+                <w:sz w:val="22"/>
+                <w:szCs w:val="22"/>
+              </w:rPr>
+              <w:t xml:space="preserve">A, C</w:t>
+            </w:r>
+          </w:p>
+        </w:tc>
+        <w:tc>
+          <w:tcPr>
+            <w:tcW w:type="dxa" w:w="2506"/>
             <w:tcBorders>
               <w:top w:val="single" w:color="8A96B5" w:sz="6"/>
               <w:left w:val="single" w:color="8A96B5" w:sz="6"/>
@@ -700,10 +722,10 @@
                 <w:b w:val="false"/>
                 <w:bCs w:val="false"/>
                 <w:color w:val="000000"/>
-                <w:sz w:val="20"/>
-                <w:szCs w:val="20"/>
-              </w:rPr>
-              <w:t xml:space="preserve">verwaltende Aufgaben im Staat · ehrenhaftes Verhalten</w:t>
+                <w:sz w:val="22"/>
+                <w:szCs w:val="22"/>
+              </w:rPr>
+              <w:t xml:space="preserve">E</w:t>
             </w:r>
           </w:p>
         </w:tc>
@@ -715,7 +737,7 @@
         </w:trPr>
         <w:tc>
           <w:tcPr>
-            <w:tcW w:type="dxa" w:w="2300"/>
+            <w:tcW w:type="dxa" w:w="2900"/>
             <w:tcBorders>
               <w:top w:val="single" w:color="8A96B5" w:sz="6"/>
               <w:left w:val="single" w:color="8A96B5" w:sz="6"/>
@@ -741,8 +763,8 @@
                 <w:b/>
                 <w:bCs/>
                 <w:color w:val="000000"/>
-                <w:sz w:val="20"/>
-                <w:szCs w:val="20"/>
+                <w:sz w:val="22"/>
+                <w:szCs w:val="22"/>
               </w:rPr>
               <w:t xml:space="preserve">Dritter Stand (Bauern und Bürger)</w:t>
             </w:r>
@@ -750,7 +772,7 @@
         </w:tc>
         <w:tc>
           <w:tcPr>
-            <w:tcW w:type="dxa" w:w="1500"/>
+            <w:tcW w:type="dxa" w:w="2300"/>
             <w:tcBorders>
               <w:top w:val="single" w:color="8A96B5" w:sz="6"/>
               <w:left w:val="single" w:color="8A96B5" w:sz="6"/>
@@ -775,8 +797,8 @@
                 <w:b w:val="false"/>
                 <w:bCs w:val="false"/>
                 <w:color w:val="000000"/>
-                <w:sz w:val="20"/>
-                <w:szCs w:val="20"/>
+                <w:sz w:val="22"/>
+                <w:szCs w:val="22"/>
               </w:rPr>
               <w:t xml:space="preserve">ca. 20 000 000</w:t>
             </w:r>
@@ -784,7 +806,7 @@
         </w:tc>
         <w:tc>
           <w:tcPr>
-            <w:tcW w:type="dxa" w:w="3300"/>
+            <w:tcW w:type="dxa" w:w="2500"/>
             <w:tcBorders>
               <w:top w:val="single" w:color="8A96B5" w:sz="6"/>
               <w:left w:val="single" w:color="8A96B5" w:sz="6"/>
@@ -809,16 +831,16 @@
                 <w:b w:val="false"/>
                 <w:bCs w:val="false"/>
                 <w:color w:val="000000"/>
-                <w:sz w:val="20"/>
-                <w:szCs w:val="20"/>
-              </w:rPr>
-              <w:t xml:space="preserve">keine Vorrechte (ausgeschlossen von der Mitbestimmung)</w:t>
-            </w:r>
-          </w:p>
-        </w:tc>
-        <w:tc>
-          <w:tcPr>
-            <w:tcW w:type="dxa" w:w="3106"/>
+                <w:sz w:val="22"/>
+                <w:szCs w:val="22"/>
+              </w:rPr>
+              <w:t xml:space="preserve">keine (vorgegeben)</w:t>
+            </w:r>
+          </w:p>
+        </w:tc>
+        <w:tc>
+          <w:tcPr>
+            <w:tcW w:type="dxa" w:w="2506"/>
             <w:tcBorders>
               <w:top w:val="single" w:color="8A96B5" w:sz="6"/>
               <w:left w:val="single" w:color="8A96B5" w:sz="6"/>
@@ -843,15 +865,29 @@
                 <w:b w:val="false"/>
                 <w:bCs w:val="false"/>
                 <w:color w:val="000000"/>
-                <w:sz w:val="20"/>
-                <w:szCs w:val="20"/>
-              </w:rPr>
-              <w:t xml:space="preserve">Steuern und hohe Abgaben (u. a. Pachtgebühren) · im Krieg Soldaten stellen</w:t>
+                <w:sz w:val="22"/>
+                <w:szCs w:val="22"/>
+              </w:rPr>
+              <w:t xml:space="preserve">F, G</w:t>
             </w:r>
           </w:p>
         </w:tc>
       </w:tr>
     </w:tbl>
+    <w:p>
+      <w:pPr>
+        <w:spacing w:after="60" w:before="60"/>
+      </w:pPr>
+      <w:r>
+        <w:rPr>
+          <w:rFonts w:ascii="Calibri" w:cs="Calibri" w:eastAsia="Calibri" w:hAnsi="Calibri"/>
+          <w:color w:val="5B6B8C"/>
+          <w:sz w:val="22"/>
+          <w:szCs w:val="22"/>
+        </w:rPr>
+        <w:t xml:space="preserve">Satz H („den König wählen“) passt zu keinem Stand.</w:t>
+      </w:r>
+    </w:p>
     <w:p>
       <w:pPr>
         <w:keepNext/>
@@ -886,7 +922,7 @@
           <w:sz w:val="22"/>
           <w:szCs w:val="22"/>
         </w:rPr>
-        <w:t xml:space="preserve">   (3 Punkte)</w:t>
+        <w:t xml:space="preserve">   (2 Punkte)</w:t>
       </w:r>
     </w:p>
     <w:p>
@@ -910,7 +946,7 @@
           <w:sz w:val="22"/>
           <w:szCs w:val="22"/>
         </w:rPr>
-        <w:t xml:space="preserve">Der Dritte Stand (Bauern und Bürger) war von der politischen Mitbestimmung ausgeschlossen.</w:t>
+        <w:t xml:space="preserve">Der Adel bestimmte das politische Geschehen mit (der Text nennt den Klerus nicht, deshalb nur der Adel erforderlich).</w:t>
       </w:r>
       <w:r>
         <w:rPr>
@@ -945,7 +981,7 @@
           <w:sz w:val="22"/>
           <w:szCs w:val="22"/>
         </w:rPr>
-        <w:t xml:space="preserve">Der Adel bestimmte das politische Geschehen mit (der Text nennt den Klerus nicht, deshalb nur der Adel erforderlich).</w:t>
+        <w:t xml:space="preserve">Der Dritte Stand (Bauern und Bürger) war von der politischen Mitbestimmung ausgeschlossen.</w:t>
       </w:r>
       <w:r>
         <w:rPr>
@@ -961,6 +997,43 @@
     </w:p>
     <w:p>
       <w:pPr>
+        <w:keepNext/>
+        <w:spacing w:after="100" w:before="240"/>
+      </w:pPr>
+      <w:r>
+        <w:rPr>
+          <w:rFonts w:ascii="Cambria" w:cs="Cambria" w:eastAsia="Cambria" w:hAnsi="Cambria"/>
+          <w:b/>
+          <w:bCs/>
+          <w:color w:val="D9534F"/>
+          <w:sz w:val="28"/>
+          <w:szCs w:val="28"/>
+        </w:rPr>
+        <w:t xml:space="preserve">Aufgabe 4  </w:t>
+      </w:r>
+      <w:r>
+        <w:rPr>
+          <w:rFonts w:ascii="Cambria" w:cs="Cambria" w:eastAsia="Cambria" w:hAnsi="Cambria"/>
+          <w:b/>
+          <w:bCs/>
+          <w:color w:val="1E2761"/>
+          <w:sz w:val="28"/>
+          <w:szCs w:val="28"/>
+        </w:rPr>
+        <w:t xml:space="preserve">Die fünf Säulen</w:t>
+      </w:r>
+      <w:r>
+        <w:rPr>
+          <w:rFonts w:ascii="Calibri" w:cs="Calibri" w:eastAsia="Calibri" w:hAnsi="Calibri"/>
+          <w:color w:val="5B6B8C"/>
+          <w:sz w:val="22"/>
+          <w:szCs w:val="22"/>
+        </w:rPr>
+        <w:t xml:space="preserve">   (8 Punkte)</w:t>
+      </w:r>
+    </w:p>
+    <w:p>
+      <w:pPr>
         <w:spacing w:after="50" w:before="0"/>
         <w:ind w:left="240"/>
       </w:pPr>
@@ -980,7 +1053,7 @@
           <w:sz w:val="22"/>
           <w:szCs w:val="22"/>
         </w:rPr>
-        <w:t xml:space="preserve">Folge: Der Dritte Stand zahlte Steuern und hohe Abgaben und finanzierte den Lebensstil der beiden ersten Stände, ohne mitreden zu dürfen.</w:t>
+        <w:t xml:space="preserve">a) Verwaltung und Justiz · Adel und Hof (Versailles) · Wirtschaft (Merkantilismus) · Religion (Gottesgnadentum) · Heer (stehendes Heer).</w:t>
       </w:r>
       <w:r>
         <w:rPr>
@@ -991,7 +1064,172 @@
           <w:sz w:val="20"/>
           <w:szCs w:val="20"/>
         </w:rPr>
-        <w:t xml:space="preserve">  [1 P]</w:t>
+        <w:t xml:space="preserve">  [5 (je 1) P]</w:t>
+      </w:r>
+    </w:p>
+    <w:p>
+      <w:pPr>
+        <w:spacing w:after="50" w:before="0"/>
+        <w:ind w:left="240"/>
+      </w:pPr>
+      <w:r>
+        <w:rPr>
+          <w:rFonts w:ascii="Calibri" w:cs="Calibri" w:eastAsia="Calibri" w:hAnsi="Calibri"/>
+          <w:color w:val="000000"/>
+          <w:sz w:val="22"/>
+          <w:szCs w:val="22"/>
+        </w:rPr>
+        <w:t xml:space="preserve">• </w:t>
+      </w:r>
+      <w:r>
+        <w:rPr>
+          <w:rFonts w:ascii="Calibri" w:cs="Calibri" w:eastAsia="Calibri" w:hAnsi="Calibri"/>
+          <w:color w:val="000000"/>
+          <w:sz w:val="22"/>
+          <w:szCs w:val="22"/>
+        </w:rPr>
+        <w:t xml:space="preserve">b) Je nach gewählter Säule, 3 P: 1 P für ein zutreffendes Merkmal, 2 P für die Erklärung der Machtsicherung (Wirkung begründen). Beispiele:</w:t>
+      </w:r>
+      <w:r>
+        <w:rPr>
+          <w:rFonts w:ascii="Calibri" w:cs="Calibri" w:eastAsia="Calibri" w:hAnsi="Calibri"/>
+          <w:b/>
+          <w:bCs/>
+          <w:color w:val="D9534F"/>
+          <w:sz w:val="20"/>
+          <w:szCs w:val="20"/>
+        </w:rPr>
+        <w:t xml:space="preserve">  [3 P]</w:t>
+      </w:r>
+    </w:p>
+    <w:p>
+      <w:pPr>
+        <w:spacing w:after="40" w:before="0"/>
+        <w:ind w:left="600"/>
+      </w:pPr>
+      <w:r>
+        <w:rPr>
+          <w:rFonts w:ascii="Calibri" w:cs="Calibri" w:eastAsia="Calibri" w:hAnsi="Calibri"/>
+          <w:b/>
+          <w:bCs/>
+          <w:color w:val="000000"/>
+          <w:sz w:val="20"/>
+          <w:szCs w:val="20"/>
+        </w:rPr>
+        <w:t xml:space="preserve">Verwaltung und Justiz: </w:t>
+      </w:r>
+      <w:r>
+        <w:rPr>
+          <w:rFonts w:ascii="Calibri" w:cs="Calibri" w:eastAsia="Calibri" w:hAnsi="Calibri"/>
+          <w:color w:val="333333"/>
+          <w:sz w:val="20"/>
+          <w:szCs w:val="20"/>
+        </w:rPr>
+        <w:t xml:space="preserve">Beamte (z. B. Intendanten in den Provinzen) handeln im Namen des Königs; er ist oberster Richter und kann ohne Gerichtsverfahren verhaften lassen („lettres de cachet“). → Kontrolle über das ganze Land.</w:t>
+      </w:r>
+    </w:p>
+    <w:p>
+      <w:pPr>
+        <w:spacing w:after="40" w:before="0"/>
+        <w:ind w:left="600"/>
+      </w:pPr>
+      <w:r>
+        <w:rPr>
+          <w:rFonts w:ascii="Calibri" w:cs="Calibri" w:eastAsia="Calibri" w:hAnsi="Calibri"/>
+          <w:b/>
+          <w:bCs/>
+          <w:color w:val="000000"/>
+          <w:sz w:val="20"/>
+          <w:szCs w:val="20"/>
+        </w:rPr>
+        <w:t xml:space="preserve">Adel und Hof von Versailles: </w:t>
+      </w:r>
+      <w:r>
+        <w:rPr>
+          <w:rFonts w:ascii="Calibri" w:cs="Calibri" w:eastAsia="Calibri" w:hAnsi="Calibri"/>
+          <w:color w:val="333333"/>
+          <w:sz w:val="20"/>
+          <w:szCs w:val="20"/>
+        </w:rPr>
+        <w:t xml:space="preserve">Der Adel behält Vorrechte (Steuerfreiheit, Jagdrecht) und wird mit Festen, Theater und Geschenken am Hof gehalten. → Er leistet keinen Widerstand.</w:t>
+      </w:r>
+    </w:p>
+    <w:p>
+      <w:pPr>
+        <w:spacing w:after="40" w:before="0"/>
+        <w:ind w:left="600"/>
+      </w:pPr>
+      <w:r>
+        <w:rPr>
+          <w:rFonts w:ascii="Calibri" w:cs="Calibri" w:eastAsia="Calibri" w:hAnsi="Calibri"/>
+          <w:b/>
+          <w:bCs/>
+          <w:color w:val="000000"/>
+          <w:sz w:val="20"/>
+          <w:szCs w:val="20"/>
+        </w:rPr>
+        <w:t xml:space="preserve">Wirtschaft (Merkantilismus): </w:t>
+      </w:r>
+      <w:r>
+        <w:rPr>
+          <w:rFonts w:ascii="Calibri" w:cs="Calibri" w:eastAsia="Calibri" w:hAnsi="Calibri"/>
+          <w:color w:val="333333"/>
+          <w:sz w:val="20"/>
+          <w:szCs w:val="20"/>
+        </w:rPr>
+        <w:t xml:space="preserve">Der Staat lenkt die Wirtschaft: Manufakturen, hohe Zölle, Kolonien als Rohstoffquellen und Absatzmärkte; mehr verkaufen als einführen. → Geld für Hof, Beamte und Heer.</w:t>
+      </w:r>
+    </w:p>
+    <w:p>
+      <w:pPr>
+        <w:spacing w:after="40" w:before="0"/>
+        <w:ind w:left="600"/>
+      </w:pPr>
+      <w:r>
+        <w:rPr>
+          <w:rFonts w:ascii="Calibri" w:cs="Calibri" w:eastAsia="Calibri" w:hAnsi="Calibri"/>
+          <w:b/>
+          <w:bCs/>
+          <w:color w:val="000000"/>
+          <w:sz w:val="20"/>
+          <w:szCs w:val="20"/>
+        </w:rPr>
+        <w:t xml:space="preserve">Religion (Gottesgnadentum): </w:t>
+      </w:r>
+      <w:r>
+        <w:rPr>
+          <w:rFonts w:ascii="Calibri" w:cs="Calibri" w:eastAsia="Calibri" w:hAnsi="Calibri"/>
+          <w:color w:val="333333"/>
+          <w:sz w:val="20"/>
+          <w:szCs w:val="20"/>
+        </w:rPr>
+        <w:t xml:space="preserve">Der König ist von Gott ausgewählt; 1685 Ende der religiösen Toleranz: ein König, ein Glaube. → Herrschaft ist von Gott gewollt, Einheit im Land.</w:t>
+      </w:r>
+    </w:p>
+    <w:p>
+      <w:pPr>
+        <w:spacing w:after="40" w:before="0"/>
+        <w:ind w:left="600"/>
+      </w:pPr>
+      <w:r>
+        <w:rPr>
+          <w:rFonts w:ascii="Calibri" w:cs="Calibri" w:eastAsia="Calibri" w:hAnsi="Calibri"/>
+          <w:b/>
+          <w:bCs/>
+          <w:color w:val="000000"/>
+          <w:sz w:val="20"/>
+          <w:szCs w:val="20"/>
+        </w:rPr>
+        <w:t xml:space="preserve">Heer (stehendes Heer): </w:t>
+      </w:r>
+      <w:r>
+        <w:rPr>
+          <w:rFonts w:ascii="Calibri" w:cs="Calibri" w:eastAsia="Calibri" w:hAnsi="Calibri"/>
+          <w:color w:val="333333"/>
+          <w:sz w:val="20"/>
+          <w:szCs w:val="20"/>
+        </w:rPr>
+        <w:t xml:space="preserve">Berufssoldaten statt Söldner, einheitlich bewaffnet, in Kasernen, dem König unterstellt (bis 400 000 Mann). → Macht nach innen und außen durchsetzen.</w:t>
       </w:r>
     </w:p>
     <w:p>
@@ -1008,7 +1246,7 @@
           <w:sz w:val="28"/>
           <w:szCs w:val="28"/>
         </w:rPr>
-        <w:t xml:space="preserve">Aufgabe 4  </w:t>
+        <w:t xml:space="preserve">Aufgabe 5  </w:t>
       </w:r>
       <w:r>
         <w:rPr>
@@ -1019,7 +1257,7 @@
           <w:sz w:val="28"/>
           <w:szCs w:val="28"/>
         </w:rPr>
-        <w:t xml:space="preserve">Die fünf Säulen</w:t>
+        <w:t xml:space="preserve">Wahr oder falsch?</w:t>
       </w:r>
       <w:r>
         <w:rPr>
@@ -1028,7 +1266,21 @@
           <w:sz w:val="22"/>
           <w:szCs w:val="22"/>
         </w:rPr>
-        <w:t xml:space="preserve">   (8 Punkte)</w:t>
+        <w:t xml:space="preserve">   (6 Punkte)</w:t>
+      </w:r>
+    </w:p>
+    <w:p>
+      <w:pPr>
+        <w:spacing w:after="60" w:before="0"/>
+      </w:pPr>
+      <w:r>
+        <w:rPr>
+          <w:rFonts w:ascii="Calibri" w:cs="Calibri" w:eastAsia="Calibri" w:hAnsi="Calibri"/>
+          <w:color w:val="5B6B8C"/>
+          <w:sz w:val="22"/>
+          <w:szCs w:val="22"/>
+        </w:rPr>
+        <w:t xml:space="preserve">Wahre Aussagen: 1 P für das richtige Kreuz. Falsche Aussagen: 1 P für das richtige Kreuz, 1 P für die zutreffende Begründung oder Verbesserung.</w:t>
       </w:r>
     </w:p>
     <w:p>
@@ -1049,10 +1301,21 @@
         <w:rPr>
           <w:rFonts w:ascii="Calibri" w:cs="Calibri" w:eastAsia="Calibri" w:hAnsi="Calibri"/>
           <w:color w:val="000000"/>
-          <w:sz w:val="22"/>
-          <w:szCs w:val="22"/>
-        </w:rPr>
-        <w:t xml:space="preserve">a) Verwaltung und Justiz · Adel und Hof (Versailles) · Wirtschaft (Merkantilismus) · Religion (Gottesgnadentum) · Heer (stehendes Heer).</w:t>
+          <w:sz w:val="21"/>
+          <w:szCs w:val="21"/>
+        </w:rPr>
+        <w:t xml:space="preserve">1  Ludwig XIV. verzichtete auf Söldner und baute ein stehendes Heer auf.  </w:t>
+      </w:r>
+      <w:r>
+        <w:rPr>
+          <w:rFonts w:ascii="Calibri" w:cs="Calibri" w:eastAsia="Calibri" w:hAnsi="Calibri"/>
+          <w:b/>
+          <w:bCs/>
+          <w:color w:val="2E9E6B"/>
+          <w:sz w:val="21"/>
+          <w:szCs w:val="21"/>
+        </w:rPr>
+        <w:t xml:space="preserve">→ wahr</w:t>
       </w:r>
       <w:r>
         <w:rPr>
@@ -1063,7 +1326,7 @@
           <w:sz w:val="20"/>
           <w:szCs w:val="20"/>
         </w:rPr>
-        <w:t xml:space="preserve">  [5 (je 1) P]</w:t>
+        <w:t xml:space="preserve">  [1 P]</w:t>
       </w:r>
     </w:p>
     <w:p>
@@ -1084,10 +1347,21 @@
         <w:rPr>
           <w:rFonts w:ascii="Calibri" w:cs="Calibri" w:eastAsia="Calibri" w:hAnsi="Calibri"/>
           <w:color w:val="000000"/>
-          <w:sz w:val="22"/>
-          <w:szCs w:val="22"/>
-        </w:rPr>
-        <w:t xml:space="preserve">b) Je nach gewählter Säule, 3 P: 1 P für ein zutreffendes Merkmal, 2 P für die Erklärung der Machtsicherung (Wirkung begründen). Beispiele:</w:t>
+          <w:sz w:val="21"/>
+          <w:szCs w:val="21"/>
+        </w:rPr>
+        <w:t xml:space="preserve">2  Der Klerus musste den Kirchenzehnt an den Dritten Stand (Bauern und Bürger) zahlen.  </w:t>
+      </w:r>
+      <w:r>
+        <w:rPr>
+          <w:rFonts w:ascii="Calibri" w:cs="Calibri" w:eastAsia="Calibri" w:hAnsi="Calibri"/>
+          <w:b/>
+          <w:bCs/>
+          <w:color w:val="D9534F"/>
+          <w:sz w:val="21"/>
+          <w:szCs w:val="21"/>
+        </w:rPr>
+        <w:t xml:space="preserve">→ falsch</w:t>
       </w:r>
       <w:r>
         <w:rPr>
@@ -1098,25 +1372,14 @@
           <w:sz w:val="20"/>
           <w:szCs w:val="20"/>
         </w:rPr>
-        <w:t xml:space="preserve">  [3 P]</w:t>
-      </w:r>
-    </w:p>
-    <w:p>
-      <w:pPr>
-        <w:spacing w:after="40" w:before="0"/>
+        <w:t xml:space="preserve">  [2 P]</w:t>
+      </w:r>
+    </w:p>
+    <w:p>
+      <w:pPr>
+        <w:spacing w:after="30" w:before="0"/>
         <w:ind w:left="600"/>
       </w:pPr>
-      <w:r>
-        <w:rPr>
-          <w:rFonts w:ascii="Calibri" w:cs="Calibri" w:eastAsia="Calibri" w:hAnsi="Calibri"/>
-          <w:b/>
-          <w:bCs/>
-          <w:color w:val="000000"/>
-          <w:sz w:val="20"/>
-          <w:szCs w:val="20"/>
-        </w:rPr>
-        <w:t xml:space="preserve">Verwaltung und Justiz: </w:t>
-      </w:r>
       <w:r>
         <w:rPr>
           <w:rFonts w:ascii="Calibri" w:cs="Calibri" w:eastAsia="Calibri" w:hAnsi="Calibri"/>
@@ -1124,25 +1387,106 @@
           <w:sz w:val="20"/>
           <w:szCs w:val="20"/>
         </w:rPr>
-        <w:t xml:space="preserve">Beamte (z. B. Intendanten in den Provinzen) handeln im Namen des Königs; er ist oberster Richter und kann ohne Gerichtsverfahren verhaften lassen („lettres de cachet“). → Kontrolle über das ganze Land.</w:t>
-      </w:r>
-    </w:p>
-    <w:p>
-      <w:pPr>
-        <w:spacing w:after="40" w:before="0"/>
-        <w:ind w:left="600"/>
-      </w:pPr>
-      <w:r>
-        <w:rPr>
-          <w:rFonts w:ascii="Calibri" w:cs="Calibri" w:eastAsia="Calibri" w:hAnsi="Calibri"/>
-          <w:b/>
-          <w:bCs/>
-          <w:color w:val="000000"/>
+        <w:t xml:space="preserve">Begründung: Umgekehrt: Der Dritte Stand (Bauern und Bürger) musste dem Klerus den Kirchenzehnt (10 % vom Einkommen) zahlen.</w:t>
+      </w:r>
+    </w:p>
+    <w:p>
+      <w:pPr>
+        <w:spacing w:after="50" w:before="0"/>
+        <w:ind w:left="240"/>
+      </w:pPr>
+      <w:r>
+        <w:rPr>
+          <w:rFonts w:ascii="Calibri" w:cs="Calibri" w:eastAsia="Calibri" w:hAnsi="Calibri"/>
+          <w:color w:val="000000"/>
+          <w:sz w:val="22"/>
+          <w:szCs w:val="22"/>
+        </w:rPr>
+        <w:t xml:space="preserve">• </w:t>
+      </w:r>
+      <w:r>
+        <w:rPr>
+          <w:rFonts w:ascii="Calibri" w:cs="Calibri" w:eastAsia="Calibri" w:hAnsi="Calibri"/>
+          <w:color w:val="000000"/>
+          <w:sz w:val="21"/>
+          <w:szCs w:val="21"/>
+        </w:rPr>
+        <w:t xml:space="preserve">3  Der Adel hatte das alleinige Jagdrecht.  </w:t>
+      </w:r>
+      <w:r>
+        <w:rPr>
+          <w:rFonts w:ascii="Calibri" w:cs="Calibri" w:eastAsia="Calibri" w:hAnsi="Calibri"/>
+          <w:b/>
+          <w:bCs/>
+          <w:color w:val="2E9E6B"/>
+          <w:sz w:val="21"/>
+          <w:szCs w:val="21"/>
+        </w:rPr>
+        <w:t xml:space="preserve">→ wahr</w:t>
+      </w:r>
+      <w:r>
+        <w:rPr>
+          <w:rFonts w:ascii="Calibri" w:cs="Calibri" w:eastAsia="Calibri" w:hAnsi="Calibri"/>
+          <w:b/>
+          <w:bCs/>
+          <w:color w:val="D9534F"/>
           <w:sz w:val="20"/>
           <w:szCs w:val="20"/>
         </w:rPr>
-        <w:t xml:space="preserve">Adel und Hof von Versailles: </w:t>
-      </w:r>
+        <w:t xml:space="preserve">  [1 P]</w:t>
+      </w:r>
+    </w:p>
+    <w:p>
+      <w:pPr>
+        <w:spacing w:after="50" w:before="0"/>
+        <w:ind w:left="240"/>
+      </w:pPr>
+      <w:r>
+        <w:rPr>
+          <w:rFonts w:ascii="Calibri" w:cs="Calibri" w:eastAsia="Calibri" w:hAnsi="Calibri"/>
+          <w:color w:val="000000"/>
+          <w:sz w:val="22"/>
+          <w:szCs w:val="22"/>
+        </w:rPr>
+        <w:t xml:space="preserve">• </w:t>
+      </w:r>
+      <w:r>
+        <w:rPr>
+          <w:rFonts w:ascii="Calibri" w:cs="Calibri" w:eastAsia="Calibri" w:hAnsi="Calibri"/>
+          <w:color w:val="000000"/>
+          <w:sz w:val="21"/>
+          <w:szCs w:val="21"/>
+        </w:rPr>
+        <w:t xml:space="preserve">4  Ludwig XIV. erlaubte den Protestanten die freie Religionsausübung.  </w:t>
+      </w:r>
+      <w:r>
+        <w:rPr>
+          <w:rFonts w:ascii="Calibri" w:cs="Calibri" w:eastAsia="Calibri" w:hAnsi="Calibri"/>
+          <w:b/>
+          <w:bCs/>
+          <w:color w:val="D9534F"/>
+          <w:sz w:val="21"/>
+          <w:szCs w:val="21"/>
+        </w:rPr>
+        <w:t xml:space="preserve">→ falsch</w:t>
+      </w:r>
+      <w:r>
+        <w:rPr>
+          <w:rFonts w:ascii="Calibri" w:cs="Calibri" w:eastAsia="Calibri" w:hAnsi="Calibri"/>
+          <w:b/>
+          <w:bCs/>
+          <w:color w:val="D9534F"/>
+          <w:sz w:val="20"/>
+          <w:szCs w:val="20"/>
+        </w:rPr>
+        <w:t xml:space="preserve">  [2 P]</w:t>
+      </w:r>
+    </w:p>
+    <w:p>
+      <w:pPr>
+        <w:spacing w:after="30" w:before="0"/>
+        <w:ind w:left="600"/>
+      </w:pPr>
       <w:r>
         <w:rPr>
           <w:rFonts w:ascii="Calibri" w:cs="Calibri" w:eastAsia="Calibri" w:hAnsi="Calibri"/>
@@ -1150,85 +1494,7 @@
           <w:sz w:val="20"/>
           <w:szCs w:val="20"/>
         </w:rPr>
-        <w:t xml:space="preserve">Der Adel behält Vorrechte (Steuerfreiheit, Jagdrecht) und wird mit Festen, Theater und Geschenken am Hof gehalten. → Er leistet keinen Widerstand.</w:t>
-      </w:r>
-    </w:p>
-    <w:p>
-      <w:pPr>
-        <w:spacing w:after="40" w:before="0"/>
-        <w:ind w:left="600"/>
-      </w:pPr>
-      <w:r>
-        <w:rPr>
-          <w:rFonts w:ascii="Calibri" w:cs="Calibri" w:eastAsia="Calibri" w:hAnsi="Calibri"/>
-          <w:b/>
-          <w:bCs/>
-          <w:color w:val="000000"/>
-          <w:sz w:val="20"/>
-          <w:szCs w:val="20"/>
-        </w:rPr>
-        <w:t xml:space="preserve">Wirtschaft (Merkantilismus): </w:t>
-      </w:r>
-      <w:r>
-        <w:rPr>
-          <w:rFonts w:ascii="Calibri" w:cs="Calibri" w:eastAsia="Calibri" w:hAnsi="Calibri"/>
-          <w:color w:val="333333"/>
-          <w:sz w:val="20"/>
-          <w:szCs w:val="20"/>
-        </w:rPr>
-        <w:t xml:space="preserve">Der Staat lenkt die Wirtschaft: Manufakturen, hohe Zölle, Kolonien als Rohstoffquellen und Absatzmärkte; mehr verkaufen als einführen. → Geld für Hof, Beamte und Heer.</w:t>
-      </w:r>
-    </w:p>
-    <w:p>
-      <w:pPr>
-        <w:spacing w:after="40" w:before="0"/>
-        <w:ind w:left="600"/>
-      </w:pPr>
-      <w:r>
-        <w:rPr>
-          <w:rFonts w:ascii="Calibri" w:cs="Calibri" w:eastAsia="Calibri" w:hAnsi="Calibri"/>
-          <w:b/>
-          <w:bCs/>
-          <w:color w:val="000000"/>
-          <w:sz w:val="20"/>
-          <w:szCs w:val="20"/>
-        </w:rPr>
-        <w:t xml:space="preserve">Religion (Gottesgnadentum): </w:t>
-      </w:r>
-      <w:r>
-        <w:rPr>
-          <w:rFonts w:ascii="Calibri" w:cs="Calibri" w:eastAsia="Calibri" w:hAnsi="Calibri"/>
-          <w:color w:val="333333"/>
-          <w:sz w:val="20"/>
-          <w:szCs w:val="20"/>
-        </w:rPr>
-        <w:t xml:space="preserve">Der König ist von Gott ausgewählt; 1685 Ende der religiösen Toleranz: ein König, ein Glaube. → Herrschaft ist von Gott gewollt, Einheit im Land.</w:t>
-      </w:r>
-    </w:p>
-    <w:p>
-      <w:pPr>
-        <w:spacing w:after="40" w:before="0"/>
-        <w:ind w:left="600"/>
-      </w:pPr>
-      <w:r>
-        <w:rPr>
-          <w:rFonts w:ascii="Calibri" w:cs="Calibri" w:eastAsia="Calibri" w:hAnsi="Calibri"/>
-          <w:b/>
-          <w:bCs/>
-          <w:color w:val="000000"/>
-          <w:sz w:val="20"/>
-          <w:szCs w:val="20"/>
-        </w:rPr>
-        <w:t xml:space="preserve">Heer (stehendes Heer): </w:t>
-      </w:r>
-      <w:r>
-        <w:rPr>
-          <w:rFonts w:ascii="Calibri" w:cs="Calibri" w:eastAsia="Calibri" w:hAnsi="Calibri"/>
-          <w:color w:val="333333"/>
-          <w:sz w:val="20"/>
-          <w:szCs w:val="20"/>
-        </w:rPr>
-        <w:t xml:space="preserve">Berufssoldaten statt Söldner, einheitlich bewaffnet, in Kasernen, dem König unterstellt (bis 400 000 Mann). → Macht nach innen und außen durchsetzen.</w:t>
+        <w:t xml:space="preserve">Begründung: 1685 beendete er die religiöse Toleranz: Wie nur einen König sollte es auch nur einen Glauben geben (Gottesgnadentum).</w:t>
       </w:r>
     </w:p>
     <w:p>
@@ -1245,7 +1511,7 @@
           <w:sz w:val="28"/>
           <w:szCs w:val="28"/>
         </w:rPr>
-        <w:t xml:space="preserve">Aufgabe 5  </w:t>
+        <w:t xml:space="preserve">Aufgabe 6  </w:t>
       </w:r>
       <w:r>
         <w:rPr>
@@ -1340,81 +1606,6 @@
     </w:p>
     <w:p>
       <w:pPr>
-        <w:spacing w:after="30" w:before="0"/>
-        <w:ind w:left="600"/>
-      </w:pPr>
-      <w:r>
-        <w:rPr>
-          <w:rFonts w:ascii="Calibri" w:cs="Calibri" w:eastAsia="Calibri" w:hAnsi="Calibri"/>
-          <w:color w:val="333333"/>
-          <w:sz w:val="20"/>
-          <w:szCs w:val="20"/>
-        </w:rPr>
-        <w:t xml:space="preserve">Vorrechte: Klerus und Adel zahlten keine Steuern (Adel zusätzlich alleiniges Jagdrecht und ranghohe Posten in der Armee), der Dritte Stand (Bauern und Bürger) zahlte Steuern, hohe Abgaben und Pachtgebühren.</w:t>
-      </w:r>
-    </w:p>
-    <w:p>
-      <w:pPr>
-        <w:spacing w:after="30" w:before="0"/>
-        <w:ind w:left="600"/>
-      </w:pPr>
-      <w:r>
-        <w:rPr>
-          <w:rFonts w:ascii="Calibri" w:cs="Calibri" w:eastAsia="Calibri" w:hAnsi="Calibri"/>
-          <w:color w:val="333333"/>
-          <w:sz w:val="20"/>
-          <w:szCs w:val="20"/>
-        </w:rPr>
-        <w:t xml:space="preserve">Mitbestimmung: Der Dritte Stand war von der politischen Mitbestimmung ausgeschlossen, der Adel bestimmte das politische Geschehen mit.</w:t>
-      </w:r>
-    </w:p>
-    <w:p>
-      <w:pPr>
-        <w:spacing w:after="30" w:before="0"/>
-        <w:ind w:left="600"/>
-      </w:pPr>
-      <w:r>
-        <w:rPr>
-          <w:rFonts w:ascii="Calibri" w:cs="Calibri" w:eastAsia="Calibri" w:hAnsi="Calibri"/>
-          <w:color w:val="333333"/>
-          <w:sz w:val="20"/>
-          <w:szCs w:val="20"/>
-        </w:rPr>
-        <w:t xml:space="preserve">Geburt: Man wurde in den Stand hineingeboren, für den Dritten Stand gab es kaum Möglichkeit aufzusteigen. In den Klerus kam man nur durch Berufung der Kirche.</w:t>
-      </w:r>
-    </w:p>
-    <w:p>
-      <w:pPr>
-        <w:spacing w:after="30" w:before="0"/>
-        <w:ind w:left="600"/>
-      </w:pPr>
-      <w:r>
-        <w:rPr>
-          <w:rFonts w:ascii="Calibri" w:cs="Calibri" w:eastAsia="Calibri" w:hAnsi="Calibri"/>
-          <w:color w:val="333333"/>
-          <w:sz w:val="20"/>
-          <w:szCs w:val="20"/>
-        </w:rPr>
-        <w:t xml:space="preserve">Bildung: Klerus und Adel waren meist sehr gebildet, vom Dritten Stand konnten nur wenige lesen und schreiben.</w:t>
-      </w:r>
-    </w:p>
-    <w:p>
-      <w:pPr>
-        <w:spacing w:after="30" w:before="0"/>
-        <w:ind w:left="600"/>
-      </w:pPr>
-      <w:r>
-        <w:rPr>
-          <w:rFonts w:ascii="Calibri" w:cs="Calibri" w:eastAsia="Calibri" w:hAnsi="Calibri"/>
-          <w:color w:val="333333"/>
-          <w:sz w:val="20"/>
-          <w:szCs w:val="20"/>
-        </w:rPr>
-        <w:t xml:space="preserve">Anzahl: Wenige Privilegierte (ca. 650 000) standen ca. 20 000 000 Menschen gegenüber, die die Last trugen.</w:t>
-      </w:r>
-    </w:p>
-    <w:p>
-      <w:pPr>
         <w:spacing w:after="50" w:before="0"/>
         <w:ind w:left="240"/>
       </w:pPr>
@@ -1471,7 +1662,7 @@
           <w:sz w:val="22"/>
           <w:szCs w:val="22"/>
         </w:rPr>
-        <w:t xml:space="preserve">(3 Zusatzpunkte)</w:t>
+        <w:t xml:space="preserve">(1 Zusatzpunkt)</w:t>
       </w:r>
     </w:p>
     <w:p>
@@ -1495,7 +1686,7 @@
           <w:sz w:val="22"/>
           <w:szCs w:val="22"/>
         </w:rPr>
-        <w:t xml:space="preserve">Der König vereint alle Macht bei sich, niemand kann ihn stoppen: absolute Herrschaft („Der Staat bin ich“ = Staat und König sind eins).</w:t>
+        <w:t xml:space="preserve">Colbert (Finanzminister Ludwigs XIV., führte den Merkantilismus ein).</w:t>
       </w:r>
       <w:r>
         <w:rPr>
@@ -1511,41 +1702,6 @@
     </w:p>
     <w:p>
       <w:pPr>
-        <w:spacing w:after="50" w:before="0"/>
-        <w:ind w:left="240"/>
-      </w:pPr>
-      <w:r>
-        <w:rPr>
-          <w:rFonts w:ascii="Calibri" w:cs="Calibri" w:eastAsia="Calibri" w:hAnsi="Calibri"/>
-          <w:color w:val="000000"/>
-          <w:sz w:val="22"/>
-          <w:szCs w:val="22"/>
-        </w:rPr>
-        <w:t xml:space="preserve">• </w:t>
-      </w:r>
-      <w:r>
-        <w:rPr>
-          <w:rFonts w:ascii="Calibri" w:cs="Calibri" w:eastAsia="Calibri" w:hAnsi="Calibri"/>
-          <w:color w:val="000000"/>
-          <w:sz w:val="22"/>
-          <w:szCs w:val="22"/>
-        </w:rPr>
-        <w:t xml:space="preserve">Zwei Säulen zutreffend einbezogen und erklärt, z. B. Verwaltung und Justiz (Beamte handeln in seinem Namen, er ist oberster Richter) und Heer (stehendes Heer setzt die Macht durch).</w:t>
-      </w:r>
-      <w:r>
-        <w:rPr>
-          <w:rFonts w:ascii="Calibri" w:cs="Calibri" w:eastAsia="Calibri" w:hAnsi="Calibri"/>
-          <w:b/>
-          <w:bCs/>
-          <w:color w:val="D9534F"/>
-          <w:sz w:val="20"/>
-          <w:szCs w:val="20"/>
-        </w:rPr>
-        <w:t xml:space="preserve">  [2 (je 1) P]</w:t>
-      </w:r>
-    </w:p>
-    <w:p>
-      <w:pPr>
         <w:spacing w:after="100" w:before="40"/>
       </w:pPr>
       <w:r>
@@ -1555,7 +1711,7 @@
           <w:sz w:val="22"/>
           <w:szCs w:val="22"/>
         </w:rPr>
-        <w:t xml:space="preserve">Die Zusatzpunkte werden zur Gesamtpunktzahl addiert. Die Höchstnote ist weiterhin ab 26 Punkten erreicht (auch mit Zusatzpunkten ausgleichbar). Maximal erreichbar: 31 Punkte.</w:t>
+        <w:t xml:space="preserve">Der Zusatzpunkt wird zur Gesamtpunktzahl addiert. Maximal erreichbar: 31 Punkte.</w:t>
       </w:r>
     </w:p>
     <w:p>
@@ -1572,7 +1728,7 @@
           <w:sz w:val="26"/>
           <w:szCs w:val="26"/>
         </w:rPr>
-        <w:t xml:space="preserve">Notenschlüssel (28 Punkte)</w:t>
+        <w:t xml:space="preserve">Notenschlüssel (30 Punkte)</w:t>
       </w:r>
     </w:p>
     <w:tbl>
@@ -1776,7 +1932,7 @@
                 <w:sz w:val="22"/>
                 <w:szCs w:val="22"/>
               </w:rPr>
-              <w:t xml:space="preserve">28 – 26</w:t>
+              <w:t xml:space="preserve">30 – 28</w:t>
             </w:r>
           </w:p>
         </w:tc>
@@ -1887,7 +2043,7 @@
                 <w:sz w:val="22"/>
                 <w:szCs w:val="22"/>
               </w:rPr>
-              <w:t xml:space="preserve">25 – 23</w:t>
+              <w:t xml:space="preserve">27 – 25</w:t>
             </w:r>
           </w:p>
         </w:tc>
@@ -1998,7 +2154,7 @@
                 <w:sz w:val="22"/>
                 <w:szCs w:val="22"/>
               </w:rPr>
-              <w:t xml:space="preserve">22 – 19</w:t>
+              <w:t xml:space="preserve">24 – 21</w:t>
             </w:r>
           </w:p>
         </w:tc>
@@ -2109,7 +2265,7 @@
                 <w:sz w:val="22"/>
                 <w:szCs w:val="22"/>
               </w:rPr>
-              <w:t xml:space="preserve">18 – 14</w:t>
+              <w:t xml:space="preserve">20 – 15</w:t>
             </w:r>
           </w:p>
         </w:tc>
@@ -2220,7 +2376,7 @@
                 <w:sz w:val="22"/>
                 <w:szCs w:val="22"/>
               </w:rPr>
-              <w:t xml:space="preserve">13 – 9</w:t>
+              <w:t xml:space="preserve">14 – 9</w:t>
             </w:r>
           </w:p>
         </w:tc>

</xml_diff>

<commit_message>
Geschichte 8: Test auf 2 Seiten, mehr Wahr/falsch, Zuordnung ohne Distraktor
Co-Authored-By: Claude Sonnet 5.5 <noreply@anthropic.com>
Claude-Session: https://claude.ai/code/session_01CtRuNVyt8v9M882BKEmgNb
</commit_message>
<xml_diff>
--- a/Geschichte_8/Test_Staendegesellschaft_Absolutismus/Erwartungshorizont_Test.docx
+++ b/Geschichte_8/Test_Staendegesellschaft_Absolutismus/Erwartungshorizont_Test.docx
@@ -45,7 +45,7 @@
           <w:sz w:val="22"/>
           <w:szCs w:val="22"/>
         </w:rPr>
-        <w:t xml:space="preserve">Gesamtpunktzahl: 30 Punkte plus 1 Zusatzpunkt. Formulierungen dürfen abweichen, entscheidend ist der Inhalt. Folgefehler werden nicht doppelt bestraft. Die Angaben stammen aus den Gruppenpuzzle-Texten (Stände, Säulen) und den Merksätzen der Wiederholungsstunde.</w:t>
+        <w:t xml:space="preserve">Gesamtpunktzahl: 32 Punkte plus 1 Zusatzpunkt. Formulierungen dürfen abweichen, entscheidend ist der Inhalt. Folgefehler werden nicht doppelt bestraft. Die Angaben stammen aus den Gruppenpuzzle-Texten (Stände, Säulen) und den Merksätzen der Wiederholungsstunde.</w:t>
       </w:r>
     </w:p>
     <w:p>
@@ -228,7 +228,7 @@
           <w:sz w:val="22"/>
           <w:szCs w:val="22"/>
         </w:rPr>
-        <w:t xml:space="preserve">a) Klerus ca. 150 000 · Adel ca. 500 000 · Dritter Stand (Bauern und Bürger) ca. 20 000 000 (Größenordnung genügt).</w:t>
+        <w:t xml:space="preserve">a) Anzahl: Klerus H (ca. 150 000) · Adel I (ca. 500 000) · Dritter Stand (Bauern und Bürger) J (ca. 20 000 000).</w:t>
       </w:r>
       <w:r>
         <w:rPr>
@@ -263,7 +263,7 @@
           <w:sz w:val="22"/>
           <w:szCs w:val="22"/>
         </w:rPr>
-        <w:t xml:space="preserve">b) Je 2 richtig eingetragene Buchstaben ergeben 1 Punkt (insgesamt 8 richtige Eintragungen). Falsch eingetragene Buchstaben heben je eine richtige Eintragung auf.</w:t>
+        <w:t xml:space="preserve">b) Vorrechte und Pflichten: Je 2 richtig eingetragene Buchstaben ergeben 1 Punkt (insgesamt 8 richtige Eintragungen). Falsch eingetragene Buchstaben heben je eine richtige Eintragung auf.</w:t>
       </w:r>
       <w:r>
         <w:rPr>
@@ -514,7 +514,7 @@
                 <w:sz w:val="22"/>
                 <w:szCs w:val="22"/>
               </w:rPr>
-              <w:t xml:space="preserve">ca. 150 000</w:t>
+              <w:t xml:space="preserve">H (ca. 150 000)</w:t>
             </w:r>
           </w:p>
         </w:tc>
@@ -657,7 +657,7 @@
                 <w:sz w:val="22"/>
                 <w:szCs w:val="22"/>
               </w:rPr>
-              <w:t xml:space="preserve">ca. 500 000</w:t>
+              <w:t xml:space="preserve">I (ca. 500 000)</w:t>
             </w:r>
           </w:p>
         </w:tc>
@@ -800,7 +800,7 @@
                 <w:sz w:val="22"/>
                 <w:szCs w:val="22"/>
               </w:rPr>
-              <w:t xml:space="preserve">ca. 20 000 000</w:t>
+              <w:t xml:space="preserve">J (ca. 20 000 000)</w:t>
             </w:r>
           </w:p>
         </w:tc>
@@ -876,20 +876,6 @@
     </w:tbl>
     <w:p>
       <w:pPr>
-        <w:spacing w:after="60" w:before="60"/>
-      </w:pPr>
-      <w:r>
-        <w:rPr>
-          <w:rFonts w:ascii="Calibri" w:cs="Calibri" w:eastAsia="Calibri" w:hAnsi="Calibri"/>
-          <w:color w:val="5B6B8C"/>
-          <w:sz w:val="22"/>
-          <w:szCs w:val="22"/>
-        </w:rPr>
-        <w:t xml:space="preserve">Satz H („den König wählen“) passt zu keinem Stand.</w:t>
-      </w:r>
-    </w:p>
-    <w:p>
-      <w:pPr>
         <w:keepNext/>
         <w:spacing w:after="100" w:before="240"/>
       </w:pPr>
@@ -1266,7 +1252,7 @@
           <w:sz w:val="22"/>
           <w:szCs w:val="22"/>
         </w:rPr>
-        <w:t xml:space="preserve">   (6 Punkte)</w:t>
+        <w:t xml:space="preserve">   (12 Punkte)</w:t>
       </w:r>
     </w:p>
     <w:p>
@@ -1499,43 +1485,6 @@
     </w:p>
     <w:p>
       <w:pPr>
-        <w:keepNext/>
-        <w:spacing w:after="100" w:before="240"/>
-      </w:pPr>
-      <w:r>
-        <w:rPr>
-          <w:rFonts w:ascii="Cambria" w:cs="Cambria" w:eastAsia="Cambria" w:hAnsi="Cambria"/>
-          <w:b/>
-          <w:bCs/>
-          <w:color w:val="D9534F"/>
-          <w:sz w:val="28"/>
-          <w:szCs w:val="28"/>
-        </w:rPr>
-        <w:t xml:space="preserve">Aufgabe 6  </w:t>
-      </w:r>
-      <w:r>
-        <w:rPr>
-          <w:rFonts w:ascii="Cambria" w:cs="Cambria" w:eastAsia="Cambria" w:hAnsi="Cambria"/>
-          <w:b/>
-          <w:bCs/>
-          <w:color w:val="1E2761"/>
-          <w:sz w:val="28"/>
-          <w:szCs w:val="28"/>
-        </w:rPr>
-        <w:t xml:space="preserve">Stellung nehmen</w:t>
-      </w:r>
-      <w:r>
-        <w:rPr>
-          <w:rFonts w:ascii="Calibri" w:cs="Calibri" w:eastAsia="Calibri" w:hAnsi="Calibri"/>
-          <w:color w:val="5B6B8C"/>
-          <w:sz w:val="22"/>
-          <w:szCs w:val="22"/>
-        </w:rPr>
-        <w:t xml:space="preserve">   (4 Punkte)</w:t>
-      </w:r>
-    </w:p>
-    <w:p>
-      <w:pPr>
         <w:spacing w:after="50" w:before="0"/>
         <w:ind w:left="240"/>
       </w:pPr>
@@ -1552,10 +1501,21 @@
         <w:rPr>
           <w:rFonts w:ascii="Calibri" w:cs="Calibri" w:eastAsia="Calibri" w:hAnsi="Calibri"/>
           <w:color w:val="000000"/>
-          <w:sz w:val="22"/>
-          <w:szCs w:val="22"/>
-        </w:rPr>
-        <w:t xml:space="preserve">Klare Position: Die Aussage stimmt nicht, denn der Stand entschied über Rechte, Pflichten und Lebenschancen.</w:t>
+          <w:sz w:val="21"/>
+          <w:szCs w:val="21"/>
+        </w:rPr>
+        <w:t xml:space="preserve">5  Der Dritte Stand (Bauern und Bürger) musste hohe Pachtgebühren an die Grundherren zahlen.  </w:t>
+      </w:r>
+      <w:r>
+        <w:rPr>
+          <w:rFonts w:ascii="Calibri" w:cs="Calibri" w:eastAsia="Calibri" w:hAnsi="Calibri"/>
+          <w:b/>
+          <w:bCs/>
+          <w:color w:val="2E9E6B"/>
+          <w:sz w:val="21"/>
+          <w:szCs w:val="21"/>
+        </w:rPr>
+        <w:t xml:space="preserve">→ wahr</w:t>
       </w:r>
       <w:r>
         <w:rPr>
@@ -1587,10 +1547,21 @@
         <w:rPr>
           <w:rFonts w:ascii="Calibri" w:cs="Calibri" w:eastAsia="Calibri" w:hAnsi="Calibri"/>
           <w:color w:val="000000"/>
-          <w:sz w:val="22"/>
-          <w:szCs w:val="22"/>
-        </w:rPr>
-        <w:t xml:space="preserve">Zwei zutreffende Argumente (je 1 P), zum Beispiel:</w:t>
+          <w:sz w:val="21"/>
+          <w:szCs w:val="21"/>
+        </w:rPr>
+        <w:t xml:space="preserve">6  Der Adel musste hohe Steuern an den König zahlen.  </w:t>
+      </w:r>
+      <w:r>
+        <w:rPr>
+          <w:rFonts w:ascii="Calibri" w:cs="Calibri" w:eastAsia="Calibri" w:hAnsi="Calibri"/>
+          <w:b/>
+          <w:bCs/>
+          <w:color w:val="D9534F"/>
+          <w:sz w:val="21"/>
+          <w:szCs w:val="21"/>
+        </w:rPr>
+        <w:t xml:space="preserve">→ falsch</w:t>
       </w:r>
       <w:r>
         <w:rPr>
@@ -1606,6 +1577,21 @@
     </w:p>
     <w:p>
       <w:pPr>
+        <w:spacing w:after="30" w:before="0"/>
+        <w:ind w:left="600"/>
+      </w:pPr>
+      <w:r>
+        <w:rPr>
+          <w:rFonts w:ascii="Calibri" w:cs="Calibri" w:eastAsia="Calibri" w:hAnsi="Calibri"/>
+          <w:color w:val="333333"/>
+          <w:sz w:val="20"/>
+          <w:szCs w:val="20"/>
+        </w:rPr>
+        <w:t xml:space="preserve">Begründung: Der Adel war steuerfrei (Vorrecht). Steuern und hohe Abgaben zahlte der Dritte Stand (Bauern und Bürger).</w:t>
+      </w:r>
+    </w:p>
+    <w:p>
+      <w:pPr>
         <w:spacing w:after="50" w:before="0"/>
         <w:ind w:left="240"/>
       </w:pPr>
@@ -1622,10 +1608,21 @@
         <w:rPr>
           <w:rFonts w:ascii="Calibri" w:cs="Calibri" w:eastAsia="Calibri" w:hAnsi="Calibri"/>
           <w:color w:val="000000"/>
-          <w:sz w:val="22"/>
-          <w:szCs w:val="22"/>
-        </w:rPr>
-        <w:t xml:space="preserve">Schlüssige Darstellung mit Fachbegriffen (z. B. Vorrechte, Steuern, Mitbestimmung) und „weil“-Verknüpfung.</w:t>
+          <w:sz w:val="21"/>
+          <w:szCs w:val="21"/>
+        </w:rPr>
+        <w:t xml:space="preserve">7  Beim Merkantilismus sollten mehr Waren ins Ausland verkauft als von dort eingeführt werden.  </w:t>
+      </w:r>
+      <w:r>
+        <w:rPr>
+          <w:rFonts w:ascii="Calibri" w:cs="Calibri" w:eastAsia="Calibri" w:hAnsi="Calibri"/>
+          <w:b/>
+          <w:bCs/>
+          <w:color w:val="2E9E6B"/>
+          <w:sz w:val="21"/>
+          <w:szCs w:val="21"/>
+        </w:rPr>
+        <w:t xml:space="preserve">→ wahr</w:t>
       </w:r>
       <w:r>
         <w:rPr>
@@ -1641,6 +1638,67 @@
     </w:p>
     <w:p>
       <w:pPr>
+        <w:spacing w:after="50" w:before="0"/>
+        <w:ind w:left="240"/>
+      </w:pPr>
+      <w:r>
+        <w:rPr>
+          <w:rFonts w:ascii="Calibri" w:cs="Calibri" w:eastAsia="Calibri" w:hAnsi="Calibri"/>
+          <w:color w:val="000000"/>
+          <w:sz w:val="22"/>
+          <w:szCs w:val="22"/>
+        </w:rPr>
+        <w:t xml:space="preserve">• </w:t>
+      </w:r>
+      <w:r>
+        <w:rPr>
+          <w:rFonts w:ascii="Calibri" w:cs="Calibri" w:eastAsia="Calibri" w:hAnsi="Calibri"/>
+          <w:color w:val="000000"/>
+          <w:sz w:val="21"/>
+          <w:szCs w:val="21"/>
+        </w:rPr>
+        <w:t xml:space="preserve">8  Die Beamten Ludwigs XIV. waren dem Adel zum Gehorsam verpflichtet.  </w:t>
+      </w:r>
+      <w:r>
+        <w:rPr>
+          <w:rFonts w:ascii="Calibri" w:cs="Calibri" w:eastAsia="Calibri" w:hAnsi="Calibri"/>
+          <w:b/>
+          <w:bCs/>
+          <w:color w:val="D9534F"/>
+          <w:sz w:val="21"/>
+          <w:szCs w:val="21"/>
+        </w:rPr>
+        <w:t xml:space="preserve">→ falsch</w:t>
+      </w:r>
+      <w:r>
+        <w:rPr>
+          <w:rFonts w:ascii="Calibri" w:cs="Calibri" w:eastAsia="Calibri" w:hAnsi="Calibri"/>
+          <w:b/>
+          <w:bCs/>
+          <w:color w:val="D9534F"/>
+          <w:sz w:val="20"/>
+          <w:szCs w:val="20"/>
+        </w:rPr>
+        <w:t xml:space="preserve">  [2 P]</w:t>
+      </w:r>
+    </w:p>
+    <w:p>
+      <w:pPr>
+        <w:spacing w:after="30" w:before="0"/>
+        <w:ind w:left="600"/>
+      </w:pPr>
+      <w:r>
+        <w:rPr>
+          <w:rFonts w:ascii="Calibri" w:cs="Calibri" w:eastAsia="Calibri" w:hAnsi="Calibri"/>
+          <w:color w:val="333333"/>
+          <w:sz w:val="20"/>
+          <w:szCs w:val="20"/>
+        </w:rPr>
+        <w:t xml:space="preserve">Begründung: Die Beamten handelten im Namen des Königs und waren ihm zum Gehorsam verpflichtet.</w:t>
+      </w:r>
+    </w:p>
+    <w:p>
+      <w:pPr>
         <w:keepNext/>
         <w:spacing w:after="100" w:before="240"/>
       </w:pPr>
@@ -1728,7 +1786,7 @@
           <w:sz w:val="26"/>
           <w:szCs w:val="26"/>
         </w:rPr>
-        <w:t xml:space="preserve">Notenschlüssel (30 Punkte)</w:t>
+        <w:t xml:space="preserve">Notenschlüssel (32 Punkte)</w:t>
       </w:r>
     </w:p>
     <w:tbl>
@@ -1932,7 +1990,7 @@
                 <w:sz w:val="22"/>
                 <w:szCs w:val="22"/>
               </w:rPr>
-              <w:t xml:space="preserve">30 – 28</w:t>
+              <w:t xml:space="preserve">32 – 30</w:t>
             </w:r>
           </w:p>
         </w:tc>
@@ -2043,7 +2101,7 @@
                 <w:sz w:val="22"/>
                 <w:szCs w:val="22"/>
               </w:rPr>
-              <w:t xml:space="preserve">27 – 25</w:t>
+              <w:t xml:space="preserve">29 – 26</w:t>
             </w:r>
           </w:p>
         </w:tc>
@@ -2154,7 +2212,7 @@
                 <w:sz w:val="22"/>
                 <w:szCs w:val="22"/>
               </w:rPr>
-              <w:t xml:space="preserve">24 – 21</w:t>
+              <w:t xml:space="preserve">25 – 22</w:t>
             </w:r>
           </w:p>
         </w:tc>
@@ -2265,7 +2323,7 @@
                 <w:sz w:val="22"/>
                 <w:szCs w:val="22"/>
               </w:rPr>
-              <w:t xml:space="preserve">20 – 15</w:t>
+              <w:t xml:space="preserve">21 – 16</w:t>
             </w:r>
           </w:p>
         </w:tc>
@@ -2376,7 +2434,7 @@
                 <w:sz w:val="22"/>
                 <w:szCs w:val="22"/>
               </w:rPr>
-              <w:t xml:space="preserve">14 – 9</w:t>
+              <w:t xml:space="preserve">15 – 10</w:t>
             </w:r>
           </w:p>
         </w:tc>
@@ -2487,7 +2545,7 @@
                 <w:sz w:val="22"/>
                 <w:szCs w:val="22"/>
               </w:rPr>
-              <w:t xml:space="preserve">8 – 0</w:t>
+              <w:t xml:space="preserve">9 – 0</w:t>
             </w:r>
           </w:p>
         </w:tc>

</xml_diff>

<commit_message>
Geschichte 8: Zusatzaufgabe Merkantilismus erklären
Co-Authored-By: Claude Sonnet 5.5 <noreply@anthropic.com>
Claude-Session: https://claude.ai/code/session_01CtRuNVyt8v9M882BKEmgNb
</commit_message>
<xml_diff>
--- a/Geschichte_8/Test_Staendegesellschaft_Absolutismus/Erwartungshorizont_Test.docx
+++ b/Geschichte_8/Test_Staendegesellschaft_Absolutismus/Erwartungshorizont_Test.docx
@@ -1611,7 +1611,7 @@
           <w:sz w:val="21"/>
           <w:szCs w:val="21"/>
         </w:rPr>
-        <w:t xml:space="preserve">7  Beim Merkantilismus sollten mehr Waren ins Ausland verkauft als von dort eingeführt werden.  </w:t>
+        <w:t xml:space="preserve">7  Ranghohe Posten in der Armee erhielten ausschließlich Adlige.  </w:t>
       </w:r>
       <w:r>
         <w:rPr>
@@ -1744,7 +1744,7 @@
           <w:sz w:val="22"/>
           <w:szCs w:val="22"/>
         </w:rPr>
-        <w:t xml:space="preserve">Colbert (Finanzminister Ludwigs XIV., führte den Merkantilismus ein).</w:t>
+        <w:t xml:space="preserve">Merkantilismus: Der Staat lenkt die Wirtschaft; es sollen mehr fertige Waren (aus Manufakturen) teuer ins Ausland verkauft als billig von dort eingeführt werden. Mindestens dieser Kerngedanke (Staat lenkt, mehr verkaufen als einführen).</w:t>
       </w:r>
       <w:r>
         <w:rPr>
@@ -1756,6 +1756,21 @@
           <w:szCs w:val="20"/>
         </w:rPr>
         <w:t xml:space="preserve">  [1 P]</w:t>
+      </w:r>
+    </w:p>
+    <w:p>
+      <w:pPr>
+        <w:spacing w:after="30" w:before="0"/>
+        <w:ind w:left="600"/>
+      </w:pPr>
+      <w:r>
+        <w:rPr>
+          <w:rFonts w:ascii="Calibri" w:cs="Calibri" w:eastAsia="Calibri" w:hAnsi="Calibri"/>
+          <w:color w:val="333333"/>
+          <w:sz w:val="20"/>
+          <w:szCs w:val="20"/>
+        </w:rPr>
+        <w:t xml:space="preserve">Weitere Elemente (nicht erforderlich): hohe Zölle auf ausländische Waren, Förderung von Manufakturen, Kolonien als Rohstoffquellen und Absatzmärkte; Ziel: Geld für Hof, Beamte und Heer.</w:t>
       </w:r>
     </w:p>
     <w:p>

</xml_diff>